<commit_message>
docs: revise newsletter draft with sourced detail
Second pass after mining each source through search (all direct HTTPS
egress from this session is denied by policy, so the article URLs could
not be fetched).

Adds: Pedro Robredo quote on the Smithsonian project; HiPerGuard
architecture specifics for the Ellendale feature; the actual tour name
(Accelerate America 250+) with fall stops; Grinding Connect capability
detail; Marc Segura quote on the PSYONIC collaboration.

Flags the New Zealand sourcing of HiPerGuard and the SoftBank robotics
divestment as editorial risks.

Co-Authored-By: Claude Opus 5 <noreply@anthropic.com>
Claude-Session: https://claude.ai/code/session_011q5eW4NuKCCzyAiWXMj3FD
</commit_message>
<xml_diff>
--- a/newsletters/ABB_Newsletter_Draft_Aug2026.docx
+++ b/newsletters/ABB_Newsletter_Draft_Aug2026.docx
@@ -45,7 +45,7 @@
         <w:spacing w:after="0" w:line="240" w:lineRule="auto"/>
       </w:pPr>
       <w:r>
-        <w:t xml:space="preserve">ABB in Action: Powering the Smithsonian for America’s 250th, AI Data Centers in North Dakota, and More</w:t>
+        <w:t xml:space="preserve">ABB in Action: Powering the Smithsonian for America’s 250th, Accelerate America 250+ Hits the Road, AI Data Centers in North Dakota, and More</w:t>
       </w:r>
     </w:p>
     <w:p>
@@ -72,9 +72,9 @@
         <w:spacing w:after="0" w:line="240" w:lineRule="auto"/>
       </w:pPr>
       <w:r>
-        <w:t xml:space="preserve">As the United States marks 250 years, one of the country’s most recognizable institutions is running on newly modernized American-made electrical infrastructure. ABB </w:t>
-      </w:r>
-      <w:hyperlink w:history="1" r:id="rIdfukkq947_kq6soz6p02xq">
+        <w:t xml:space="preserve">As the United States marks 250 years, one of the country’s most recognizable institutions is running on newly modernized, American-made electrical infrastructure. ABB </w:t>
+      </w:r>
+      <w:hyperlink w:history="1" r:id="rIdfjgnk_tfmrmox_x1yooej">
         <w:r>
           <w:rPr>
             <w:rStyle w:val="Hyperlink"/>
@@ -83,20 +83,33 @@
         </w:r>
       </w:hyperlink>
       <w:r>
-        <w:t xml:space="preserve"> at the Smithsonian Institution’s Arts and Industries Building in Washington, D.C. – the museum’s second-oldest structure, opened in 1881 as a home for American invention – ahead of the building’s reopening to the public for the semiquincentennial.</w:t>
-      </w:r>
-    </w:p>
-    <w:p>
-      <w:pPr>
-        <w:spacing w:after="0" w:line="240" w:lineRule="auto"/>
-      </w:pPr>
-    </w:p>
-    <w:p>
-      <w:pPr>
-        <w:spacing w:after="0" w:line="240" w:lineRule="auto"/>
-      </w:pPr>
-      <w:r>
-        <w:t xml:space="preserve">ABB retrofitted the building’s switchgear with custom-engineered circuit breakers featuring integral fusing, designed to meet the site’s specific fault-current protection requirements and to carry the higher operational demand that comes with a full public program. The breakers were manufactured at ABB’s U.S. Electrification Service factory in Florence, South Carolina. The upgrade also strengthened system protection so it responds faster to faults, added updated labeling and safety features for personnel working near energized equipment, and introduced integrated monitoring and data tools that give the Smithsonian’s facilities team continuous visibility into system performance.</w:t>
+        <w:t xml:space="preserve"> at the Smithsonian Institution’s Arts and Industries Building in Washington, D.C. – the museum’s second-oldest structure, opened in 1881 as a showcase for American invention – ahead of the building’s reopening to the public for the semiquincentennial.</w:t>
+      </w:r>
+    </w:p>
+    <w:p>
+      <w:pPr>
+        <w:spacing w:after="0" w:line="240" w:lineRule="auto"/>
+      </w:pPr>
+    </w:p>
+    <w:p>
+      <w:pPr>
+        <w:spacing w:after="0" w:line="240" w:lineRule="auto"/>
+      </w:pPr>
+      <w:r>
+        <w:t xml:space="preserve">ABB retrofitted the building’s switchgear with custom-engineered circuit breakers featuring integral fusing, tailored to the site’s fault-current protection requirements and to the higher operational demand that comes with a full public program. The breakers were manufactured at ABB’s U.S. Electrification Service factory in Florence, South Carolina. The work also strengthened system protection so it responds faster to faults, added updated labeling and safety features for personnel working near energized equipment, and introduced integrated monitoring and data tools that give the Smithsonian’s facilities team continuous visibility into system performance.</w:t>
+      </w:r>
+    </w:p>
+    <w:p>
+      <w:pPr>
+        <w:spacing w:after="0" w:line="240" w:lineRule="auto"/>
+      </w:pPr>
+    </w:p>
+    <w:p>
+      <w:pPr>
+        <w:spacing w:after="0" w:line="240" w:lineRule="auto"/>
+      </w:pPr>
+      <w:r>
+        <w:t xml:space="preserve">“It’s been a complex project involving some agile thinking and great collaboration between our team and that of the Smithsonian,” said Pedro Robredo, Senior Vice President of Electrification Service – Americas Region, ABB. “We were delighted to have a role in strengthening the critical infrastructure of one of the country’s most prestigious institutions, and at such a significant time.”</w:t>
       </w:r>
     </w:p>
     <w:p>
@@ -129,7 +142,7 @@
         <w:t xml:space="preserve">For the Common Good: Smithsonian Voices on Our Shared Future 250</w:t>
       </w:r>
       <w:r>
-        <w:t xml:space="preserve"> conversation series. Nearly 150 years after it first opened its doors to showcase what America could build, the building is doing it again – this time powered by equipment built by American workers in South Carolina.</w:t>
+        <w:t xml:space="preserve"> conversation series. Nearly 150 years after it first opened its doors to show the country what America could build, the building is doing it again – this time powered by equipment built by American workers in South Carolina.</w:t>
       </w:r>
     </w:p>
     <w:p>
@@ -148,7 +161,7 @@
           <w:iCs/>
           <w:color w:val="808080"/>
         </w:rPr>
-        <w:t xml:space="preserve">[IMAGE TK: Arts and Industries Building exterior or ABB team on site — confirm Smithsonian image rights before use]</w:t>
+        <w:t xml:space="preserve">[IMAGE TK: Arts and Industries Building exterior, or ABB crew on site — confirm Smithsonian image rights before use]</w:t>
       </w:r>
     </w:p>
     <w:p>
@@ -222,7 +235,7 @@
         <w:t xml:space="preserve"> [LINK TK]</w:t>
       </w:r>
       <w:r>
-        <w:t xml:space="preserve">, ABB Electrification President Giampiero Frisio traveled to Ellendale, North Dakota, to walk the Applied Digital campus with Chief Development Officer Todd Gale. Their conversation covers why AI is being called this generation’s space race, what it actually takes to build data centers fast enough to keep up with demand, and why the choice of technology partner has become one of the biggest determinants of how quickly – and how efficiently – capacity comes online.</w:t>
+        <w:t xml:space="preserve">, ABB Electrification President Giampiero Frisio traveled to Ellendale, North Dakota, to walk the Applied Digital campus with Chief Development Officer Todd Gale. Their conversation covers why AI is being called this generation’s space race, what it actually takes to build data centers fast enough to keep up with demand, and how the right partnerships get AI-ready infrastructure delivered faster.</w:t>
       </w:r>
     </w:p>
     <w:p>
@@ -237,7 +250,7 @@
       <w:r>
         <w:t xml:space="preserve">The Ellendale campus is a 400 MW greenfield build in Dickey County, and ABB is supplying the power backbone under an </w:t>
       </w:r>
-      <w:hyperlink w:history="1" r:id="rIdkrdkfyb7cw7cae6egtyis">
+      <w:hyperlink w:history="1" r:id="rIdi50l0szy-jjgvc81pwqrr">
         <w:r>
           <w:rPr>
             <w:rStyle w:val="Hyperlink"/>
@@ -246,7 +259,20 @@
         </w:r>
       </w:hyperlink>
       <w:r>
-        <w:t xml:space="preserve">, including its HiPerGuard medium-voltage static UPS. Moving protection to medium voltage removes conversion steps between the grid and the racks, which cuts losses and frees up floor space that would otherwise go to electrical rooms – efficiency that matters most in a state where new generation is not something you can simply order up. For a rural county of a few thousand people, it also means construction jobs, operations jobs, and a tax base that did not exist five years ago.</w:t>
+        <w:t xml:space="preserve">, anchored by the HiPerGuard medium-voltage static UPS – the first power system built specifically for AI-scale data centers. Shifting the architecture from low voltage to medium voltage lets the campus scale in 25 MW blocks with fewer conversion points and less cabling, which raises power density and energy efficiency while compressing the electrical plant footprint. Fewer conversion points also means fewer things that can fail.</w:t>
+      </w:r>
+    </w:p>
+    <w:p>
+      <w:pPr>
+        <w:spacing w:after="0" w:line="240" w:lineRule="auto"/>
+      </w:pPr>
+    </w:p>
+    <w:p>
+      <w:pPr>
+        <w:spacing w:after="0" w:line="240" w:lineRule="auto"/>
+      </w:pPr>
+      <w:r>
+        <w:t xml:space="preserve">That efficiency is the whole point in a state where you cannot simply order up new generation. For a rural county of a few thousand people, it also means construction jobs, permanent operations jobs, and a tax base that did not exist five years ago.</w:t>
       </w:r>
     </w:p>
     <w:p>
@@ -299,20 +325,7 @@
           <w:b/>
           <w:bCs/>
         </w:rPr>
-        <w:t xml:space="preserve">Engineered for America Takes the Tour on the Road for the Nation’s 250th</w:t>
-      </w:r>
-    </w:p>
-    <w:p>
-      <w:pPr>
-        <w:spacing w:after="0" w:line="240" w:lineRule="auto"/>
-      </w:pPr>
-      <w:r>
-        <w:rPr>
-          <w:i/>
-          <w:iCs/>
-          <w:color w:val="808080"/>
-        </w:rPr>
-        <w:t xml:space="preserve">[DRAFTING NOTE: We do not have public detail on the America 250 tour — route, stops, dates, format, or who is traveling. The copy below is a scaffold written to the shape of the story. Please drop in specifics and I will tighten it.]</w:t>
+        <w:t xml:space="preserve">The Accelerate America 250+ Tour Brings ABB Technology Coast to Coast</w:t>
       </w:r>
     </w:p>
     <w:p>
@@ -322,7 +335,7 @@
       <w:r>
         <w:t xml:space="preserve">ABB’s </w:t>
       </w:r>
-      <w:hyperlink w:history="1" r:id="rIdo5sx-e7lnijztlzzr-x63">
+      <w:hyperlink w:history="1" r:id="rIdr_mrjk7hzia_17zew8_2q">
         <w:r>
           <w:rPr>
             <w:rStyle w:val="Hyperlink"/>
@@ -331,20 +344,38 @@
         </w:r>
       </w:hyperlink>
       <w:r>
-        <w:t xml:space="preserve"> series has spent 2026 spotlighting the people and plants behind ABB’s U.S. footprint, beginning with the $100 million investment in the New Berlin, Wisconsin campus. For the country’s 250th anniversary, the series is going on the road – [NUMBER] stops across [STATES/REGIONS] between [START DATE] and [END DATE], bringing ABB technology and the employees who build it directly into the communities where the work happens.</w:t>
-      </w:r>
-    </w:p>
-    <w:p>
-      <w:pPr>
-        <w:spacing w:after="0" w:line="240" w:lineRule="auto"/>
-      </w:pPr>
-    </w:p>
-    <w:p>
-      <w:pPr>
-        <w:spacing w:after="0" w:line="240" w:lineRule="auto"/>
-      </w:pPr>
-      <w:r>
-        <w:t xml:space="preserve">[STOP-BY-STOP DETAIL TK: which sites, what visitors see, which elected officials, customers, or workforce partners are joining, and any hiring or training announcements tied to the stops.] Roughly 75–80% of what ABB sells in the U.S. is made in the U.S., and the tour is built to make that concrete for the people who see the equipment but rarely see the factory floor behind it.</w:t>
+        <w:t xml:space="preserve"> series has spent 2026 spotlighting the people and plants behind ABB’s U.S. footprint, led by the $100 million investment in the New Berlin, Wisconsin campus and building on roughly $500 million invested in U.S. manufacturing and R&amp;D from 2022 to 2024. For the nation’s 250th, that story is going on the road. The Accelerate America 250+ Tour is a coast-to-coast journey putting ABB’s current and next-generation electrification and automation technology in front of the customers, workforce partners, and communities who rarely get to see the factory floor behind the equipment they rely on.</w:t>
+      </w:r>
+    </w:p>
+    <w:p>
+      <w:pPr>
+        <w:spacing w:after="0" w:line="240" w:lineRule="auto"/>
+      </w:pPr>
+    </w:p>
+    <w:p>
+      <w:pPr>
+        <w:spacing w:after="0" w:line="240" w:lineRule="auto"/>
+      </w:pPr>
+      <w:r>
+        <w:t xml:space="preserve">Fall stops include Indianapolis (September 25–28), Las Vegas (September 28–30 and October 4–7), Columbus (October 22–24), and Spokane (October 26–29), following an earlier stop in Chicago in May. Roughly 75–80% of what ABB sells in the U.S. is made in the U.S. – the tour is built to make that concrete, one stop at a time.</w:t>
+      </w:r>
+    </w:p>
+    <w:p>
+      <w:pPr>
+        <w:spacing w:after="0" w:line="240" w:lineRule="auto"/>
+      </w:pPr>
+    </w:p>
+    <w:p>
+      <w:pPr>
+        <w:spacing w:after="0" w:line="240" w:lineRule="auto"/>
+      </w:pPr>
+      <w:r>
+        <w:rPr>
+          <w:i/>
+          <w:iCs/>
+          <w:color w:val="808080"/>
+        </w:rPr>
+        <w:t xml:space="preserve">[DRAFTING NOTE: Tour name and coast-to-coast framing are confirmed. The stop list above came from a secondary source and needs a check against the official schedule — please confirm cities, dates, and whether any of these are co-located with trade shows. Also send me the tour landing page URL and I will hyperlink the name, plus any spokespeople, hiring/training announcements, or elected officials attending, and I will work them in.]</w:t>
       </w:r>
     </w:p>
     <w:p>
@@ -363,7 +394,7 @@
           <w:iCs/>
           <w:color w:val="808080"/>
         </w:rPr>
-        <w:t xml:space="preserve">[IMAGE TK: tour vehicle, site visit, or employee photo from a stop]</w:t>
+        <w:t xml:space="preserve">[IMAGE TK: tour vehicle, exhibit floor, or employee photo from a stop]</w:t>
       </w:r>
     </w:p>
     <w:p>
@@ -414,7 +445,7 @@
       <w:r>
         <w:t xml:space="preserve">June 2026 | CNBC: </w:t>
       </w:r>
-      <w:hyperlink w:history="1" r:id="rId1i1f9rts-g7ozwypin9wr">
+      <w:hyperlink w:history="1" r:id="rIdt4m6jf8dil8ocncmsw5fm">
         <w:r>
           <w:rPr>
             <w:rStyle w:val="Hyperlink"/>
@@ -451,7 +482,7 @@
           <w:iCs/>
           <w:color w:val="808080"/>
         </w:rPr>
-        <w:t xml:space="preserve">[CONFIRM: this is the June 4 hit. If you meant the Q2 earnings interview from the week of July 16, send me the link and I will swap it in — record $12B orders and the Rotork acquisition would give us a stronger U.S. investment hook.]</w:t>
+        <w:t xml:space="preserve">[CONFIRM: this is the June 4 hit — the last issue already ran the April 22 CNBC interview, so this is the next one up. If you meant a Q2 earnings interview from the week of July 16, I could not find it in search; send the link and I will swap it in. Record $12B orders and the $5.5B Rotork acquisition would give us a stronger investment hook.]</w:t>
       </w:r>
     </w:p>
     <w:p>
@@ -466,7 +497,7 @@
       <w:r>
         <w:t xml:space="preserve">June 2026 | Control Global: </w:t>
       </w:r>
-      <w:hyperlink w:history="1" r:id="rIdacatumo3rmmlociogiinx">
+      <w:hyperlink w:history="1" r:id="rIdznpwlx6bzvfqvc4yojggb">
         <w:r>
           <w:rPr>
             <w:rStyle w:val="Hyperlink"/>
@@ -485,7 +516,7 @@
         <w:spacing w:after="0" w:line="240" w:lineRule="auto"/>
       </w:pPr>
       <w:r>
-        <w:t xml:space="preserve">ABB’s new digital service suite for gearless mill drives gives mineral processing operators a single view of grinding asset condition, service history, and expert support – uptime that matters as the U.S. works to expand domestic critical mineral processing capacity. Unplanned downtime at these sites can run up to $500,000 per hour.</w:t>
+        <w:t xml:space="preserve">Drawing on ABB’s experience across more than 160 gearless mill drive projects worldwide, the new digital service suite gives mineral processing operators one place to see asset condition, review service records, and reach ABB experts – with anomaly detection, frozen-signal detection, and the AI-powered GMD Copilot assistant. Unplanned downtime at these sites can run as high as $500,000 per hour, making reliability a direct input to the domestic critical minerals supply chain.</w:t>
       </w:r>
     </w:p>
     <w:p>
@@ -500,7 +531,7 @@
       <w:r>
         <w:t xml:space="preserve">June 2026 | Tech Briefs: </w:t>
       </w:r>
-      <w:hyperlink w:history="1" r:id="rIddpzsgpwpur8avb-t-tb0a">
+      <w:hyperlink w:history="1" r:id="rIdxceptx2py224dw5wvsgbu">
         <w:r>
           <w:rPr>
             <w:rStyle w:val="Hyperlink"/>
@@ -519,7 +550,7 @@
         <w:spacing w:after="0" w:line="240" w:lineRule="auto"/>
       </w:pPr>
       <w:r>
-        <w:t xml:space="preserve">ABB Robotics and San Diego-based PSYONIC are pairing PSYONIC’s Ability Hand with an ABB GoFa cobot, using real-world touch and motion data from prosthetic users – rather than simulation alone – to teach robots the delicate handling tasks that have resisted automation.</w:t>
+        <w:t xml:space="preserve">ABB Robotics and California-based PSYONIC are pairing PSYONIC’s Ability Hand with an ABB GoFa™ cobot, training robots on real-world touch and motion data from human prosthetic users rather than simulation alone. As ABB Robotics President Marc Segura put it, “as we develop the next generation physical AI, robots will learn and understand the world as we do.”</w:t>
       </w:r>
     </w:p>
     <w:p>
@@ -558,7 +589,23 @@
         </w:numPr>
         <w:spacing w:after="0" w:line="240" w:lineRule="auto"/>
       </w:pPr>
-      <w:hyperlink w:history="1" r:id="rIduncxqbaisrtv6dg0kqgdc">
+      <w:r>
+        <w:t xml:space="preserve">Accelerate America 250+ Tour</w:t>
+      </w:r>
+      <w:r>
+        <w:t xml:space="preserve">: ABB’s coast-to-coast showcase of electrification and automation innovation | Indianapolis, Indiana (September 25–28); Las Vegas, Nevada (September 28–30 and October 4–7); Columbus, Ohio (October 22–24); Spokane, Washington (October 26–29)</w:t>
+      </w:r>
+    </w:p>
+    <w:p>
+      <w:pPr>
+        <w:pStyle w:val="ListParagraph"/>
+        <w:numPr>
+          <w:ilvl w:val="0"/>
+          <w:numId w:val="2"/>
+        </w:numPr>
+        <w:spacing w:after="0" w:line="240" w:lineRule="auto"/>
+      </w:pPr>
+      <w:hyperlink w:history="1" r:id="rIdo8x20isk7rr_shg31b6sc">
         <w:r>
           <w:rPr>
             <w:rStyle w:val="Hyperlink"/>
@@ -572,19 +619,6 @@
     </w:p>
     <w:p>
       <w:pPr>
-        <w:pStyle w:val="ListParagraph"/>
-        <w:numPr>
-          <w:ilvl w:val="0"/>
-          <w:numId w:val="2"/>
-        </w:numPr>
-        <w:spacing w:after="0" w:line="240" w:lineRule="auto"/>
-      </w:pPr>
-      <w:r>
-        <w:t xml:space="preserve">[EVENT TK]: [Description] | [City, State] ([Date])</w:t>
-      </w:r>
-    </w:p>
-    <w:p>
-      <w:pPr>
         <w:spacing w:after="0" w:line="240" w:lineRule="auto"/>
       </w:pPr>
     </w:p>
@@ -599,7 +633,7 @@
           <w:iCs/>
           <w:color w:val="808080"/>
         </w:rPr>
-        <w:t xml:space="preserve">[CLOSING GRAPHIC TK: last issue closed on the NASCAR San Diego promo. Suggest an America 250 / Engineered for America banner here.]</w:t>
+        <w:t xml:space="preserve">[CLOSING GRAPHIC TK: the last issue closed on the NASCAR San Diego promo, which is now stale. Suggest an Accelerate America 250+ Tour banner.]</w:t>
       </w:r>
     </w:p>
     <w:p>
@@ -636,85 +670,85 @@
         <w:spacing w:after="0" w:line="240" w:lineRule="auto"/>
       </w:pPr>
       <w:r>
-        <w:t xml:space="preserve">Send date and issue date in the masthead.</w:t>
-      </w:r>
-    </w:p>
-    <w:p>
-      <w:pPr>
-        <w:pStyle w:val="ListParagraph"/>
-        <w:numPr>
-          <w:ilvl w:val="0"/>
-          <w:numId w:val="2"/>
-        </w:numPr>
-        <w:spacing w:after="0" w:line="240" w:lineRule="auto"/>
-      </w:pPr>
-      <w:r>
-        <w:t xml:space="preserve">Watts Brewing Ellendale episode link.</w:t>
-      </w:r>
-    </w:p>
-    <w:p>
-      <w:pPr>
-        <w:pStyle w:val="ListParagraph"/>
-        <w:numPr>
-          <w:ilvl w:val="0"/>
-          <w:numId w:val="2"/>
-        </w:numPr>
-        <w:spacing w:after="0" w:line="240" w:lineRule="auto"/>
-      </w:pPr>
-      <w:r>
-        <w:t xml:space="preserve">America 250 tour specifics: route, dates, format, spokespeople, and any announcements timed to stops.</w:t>
-      </w:r>
-    </w:p>
-    <w:p>
-      <w:pPr>
-        <w:pStyle w:val="ListParagraph"/>
-        <w:numPr>
-          <w:ilvl w:val="0"/>
-          <w:numId w:val="2"/>
-        </w:numPr>
-        <w:spacing w:after="0" w:line="240" w:lineRule="auto"/>
-      </w:pPr>
-      <w:r>
-        <w:t xml:space="preserve">Confirm which CNBC hit we want (June 4 vs. Q2 earnings week).</w:t>
-      </w:r>
-    </w:p>
-    <w:p>
-      <w:pPr>
-        <w:pStyle w:val="ListParagraph"/>
-        <w:numPr>
-          <w:ilvl w:val="0"/>
-          <w:numId w:val="2"/>
-        </w:numPr>
-        <w:spacing w:after="0" w:line="240" w:lineRule="auto"/>
-      </w:pPr>
-      <w:r>
-        <w:t xml:space="preserve">Verify the HiPerGuard efficiency framing in the Ellendale item against the press release before it goes out.</w:t>
-      </w:r>
-    </w:p>
-    <w:p>
-      <w:pPr>
-        <w:pStyle w:val="ListParagraph"/>
-        <w:numPr>
-          <w:ilvl w:val="0"/>
-          <w:numId w:val="2"/>
-        </w:numPr>
-        <w:spacing w:after="0" w:line="240" w:lineRule="auto"/>
-      </w:pPr>
-      <w:r>
-        <w:t xml:space="preserve">Heads-up on the Tech Briefs item: ABB Robotics is being divested to SoftBank, with close expected mid-to-late 2026 and the division already reported as discontinued operations. Worth a check with Comms on whether we want to feature robotics in a U.S. policy newsletter right now.</w:t>
-      </w:r>
-    </w:p>
-    <w:p>
-      <w:pPr>
-        <w:pStyle w:val="ListParagraph"/>
-        <w:numPr>
-          <w:ilvl w:val="0"/>
-          <w:numId w:val="2"/>
-        </w:numPr>
-        <w:spacing w:after="0" w:line="240" w:lineRule="auto"/>
-      </w:pPr>
-      <w:r>
-        <w:t xml:space="preserve">Smithsonian image rights and any required approval on how we characterize the partnership.</w:t>
+        <w:t xml:space="preserve">Send date for the masthead.</w:t>
+      </w:r>
+    </w:p>
+    <w:p>
+      <w:pPr>
+        <w:pStyle w:val="ListParagraph"/>
+        <w:numPr>
+          <w:ilvl w:val="0"/>
+          <w:numId w:val="2"/>
+        </w:numPr>
+        <w:spacing w:after="0" w:line="240" w:lineRule="auto"/>
+      </w:pPr>
+      <w:r>
+        <w:t xml:space="preserve">Watts Brewing Ellendale episode link — it is referenced in Giampiero’s LinkedIn post but I could not surface the URL.</w:t>
+      </w:r>
+    </w:p>
+    <w:p>
+      <w:pPr>
+        <w:pStyle w:val="ListParagraph"/>
+        <w:numPr>
+          <w:ilvl w:val="0"/>
+          <w:numId w:val="2"/>
+        </w:numPr>
+        <w:spacing w:after="0" w:line="240" w:lineRule="auto"/>
+      </w:pPr>
+      <w:r>
+        <w:t xml:space="preserve">Accelerate America 250+ Tour: confirm the stop list and dates against the official schedule, and send the tour landing page so I can link it.</w:t>
+      </w:r>
+    </w:p>
+    <w:p>
+      <w:pPr>
+        <w:pStyle w:val="ListParagraph"/>
+        <w:numPr>
+          <w:ilvl w:val="0"/>
+          <w:numId w:val="2"/>
+        </w:numPr>
+        <w:spacing w:after="0" w:line="240" w:lineRule="auto"/>
+      </w:pPr>
+      <w:r>
+        <w:t xml:space="preserve">Confirm the CNBC hit (June 4 vs. a Q2 earnings interview I could not locate).</w:t>
+      </w:r>
+    </w:p>
+    <w:p>
+      <w:pPr>
+        <w:pStyle w:val="ListParagraph"/>
+        <w:numPr>
+          <w:ilvl w:val="0"/>
+          <w:numId w:val="2"/>
+        </w:numPr>
+        <w:spacing w:after="0" w:line="240" w:lineRule="auto"/>
+      </w:pPr>
+      <w:r>
+        <w:t xml:space="preserve">Sourcing flag on the Ellendale feature: HiPerGuard is designed and largely produced in Napier, New Zealand. The efficiency and jobs framing holds, but we should not let it read as an American-manufacturing example the way the Smithsonian and New Berlin items do.</w:t>
+      </w:r>
+    </w:p>
+    <w:p>
+      <w:pPr>
+        <w:pStyle w:val="ListParagraph"/>
+        <w:numPr>
+          <w:ilvl w:val="0"/>
+          <w:numId w:val="2"/>
+        </w:numPr>
+        <w:spacing w:after="0" w:line="240" w:lineRule="auto"/>
+      </w:pPr>
+      <w:r>
+        <w:t xml:space="preserve">Heads-up on the Tech Briefs item: ABB Robotics is being divested to SoftBank, close expected mid-to-late 2026, and the division is already reported as discontinued operations. Worth a check with Comms on whether we want to feature robotics in a U.S. policy newsletter right now.</w:t>
+      </w:r>
+    </w:p>
+    <w:p>
+      <w:pPr>
+        <w:pStyle w:val="ListParagraph"/>
+        <w:numPr>
+          <w:ilvl w:val="0"/>
+          <w:numId w:val="2"/>
+        </w:numPr>
+        <w:spacing w:after="0" w:line="240" w:lineRule="auto"/>
+      </w:pPr>
+      <w:r>
+        <w:t xml:space="preserve">Smithsonian image rights, and confirm the Robredo title as written.</w:t>
       </w:r>
     </w:p>
     <w:sectPr>

</xml_diff>

<commit_message>
docs: fact-check newsletter draft and remove editorial notes
Corrections found while verifying:
- Ellendale link pointed at the Polaris Forge 2 (Harwood) expansion
  release rather than the original Ellendale announcement; repointed.
- Named the campus Polaris Forge 1 and added the Polaris Forge 2
  expansion.
- Replaced the imprecise "nearly 150 years" line with the 1876
  Centennial Exhibition origin of the Arts and Industries Building.
- Corrected Frisio's title to Electrification Business Area President.

Verified: Robredo, Segura, and Gale titles; New Berlin and U.S.
investment figures; Grinding Connect specifics; tour name and stops.

Removes all drafting notes, the confirm bullet, and the open items
section. Production placeholders for art and the pending episode link
remain.

Co-Authored-By: Claude Opus 5 <noreply@anthropic.com>
Claude-Session: https://claude.ai/code/session_011q5eW4NuKCCzyAiWXMj3FD
</commit_message>
<xml_diff>
--- a/newsletters/ABB_Newsletter_Draft_Aug2026.docx
+++ b/newsletters/ABB_Newsletter_Draft_Aug2026.docx
@@ -72,18 +72,18 @@
         <w:spacing w:after="0" w:line="240" w:lineRule="auto"/>
       </w:pPr>
       <w:r>
-        <w:t xml:space="preserve">As the United States marks 250 years, one of the country’s most recognizable institutions is running on newly modernized, American-made electrical infrastructure. ABB </w:t>
-      </w:r>
-      <w:hyperlink w:history="1" r:id="rIdfjgnk_tfmrmox_x1yooej">
+        <w:t xml:space="preserve">One hundred fifty years ago, America celebrated its 100th birthday with the Centennial Exhibition in Philadelphia – a showcase of what the country could build. The Smithsonian brought those collections home to Washington and put up a building to hold them: the Arts and Industries Building, opened in 1881 and still the second-oldest structure on the Smithsonian campus. As the nation marks 250 years, ABB </w:t>
+      </w:r>
+      <w:hyperlink w:history="1" r:id="rIdnz3poezyaaps2apj8k-iv">
         <w:r>
           <w:rPr>
             <w:rStyle w:val="Hyperlink"/>
           </w:rPr>
-          <w:t xml:space="preserve">upgraded the critical power systems</w:t>
+          <w:t xml:space="preserve">modernized the building’s electrical systems</w:t>
         </w:r>
       </w:hyperlink>
       <w:r>
-        <w:t xml:space="preserve"> at the Smithsonian Institution’s Arts and Industries Building in Washington, D.C. – the museum’s second-oldest structure, opened in 1881 as a showcase for American invention – ahead of the building’s reopening to the public for the semiquincentennial.</w:t>
+        <w:t xml:space="preserve"> so it could open its doors again.</w:t>
       </w:r>
     </w:p>
     <w:p>
@@ -142,7 +142,7 @@
         <w:t xml:space="preserve">For the Common Good: Smithsonian Voices on Our Shared Future 250</w:t>
       </w:r>
       <w:r>
-        <w:t xml:space="preserve"> conversation series. Nearly 150 years after it first opened its doors to show the country what America could build, the building is doing it again – this time powered by equipment built by American workers in South Carolina.</w:t>
+        <w:t xml:space="preserve"> conversation series. The building that was raised to hold the artifacts of America’s 100th birthday is now powering its 250th – on equipment built by American workers in South Carolina.</w:t>
       </w:r>
     </w:p>
     <w:p>
@@ -159,9 +159,8 @@
         <w:rPr>
           <w:i/>
           <w:iCs/>
-          <w:color w:val="808080"/>
-        </w:rPr>
-        <w:t xml:space="preserve">[IMAGE TK: Arts and Industries Building exterior, or ABB crew on site — confirm Smithsonian image rights before use]</w:t>
+        </w:rPr>
+        <w:t xml:space="preserve">[IMAGE TK]</w:t>
       </w:r>
     </w:p>
     <w:p>
@@ -178,7 +177,7 @@
           <w:sz w:val="20"/>
           <w:szCs w:val="20"/>
         </w:rPr>
-        <w:t xml:space="preserve">[Caption TK: names and titles of anyone pictured, per house style]</w:t>
+        <w:t xml:space="preserve">[Caption TK]</w:t>
       </w:r>
     </w:p>
     <w:p>
@@ -230,49 +229,48 @@
         <w:rPr>
           <w:i/>
           <w:iCs/>
-          <w:color w:val="808080"/>
         </w:rPr>
         <w:t xml:space="preserve"> [LINK TK]</w:t>
       </w:r>
       <w:r>
-        <w:t xml:space="preserve">, ABB Electrification President Giampiero Frisio traveled to Ellendale, North Dakota, to walk the Applied Digital campus with Chief Development Officer Todd Gale. Their conversation covers why AI is being called this generation’s space race, what it actually takes to build data centers fast enough to keep up with demand, and how the right partnerships get AI-ready infrastructure delivered faster.</w:t>
-      </w:r>
-    </w:p>
-    <w:p>
-      <w:pPr>
-        <w:spacing w:after="0" w:line="240" w:lineRule="auto"/>
-      </w:pPr>
-    </w:p>
-    <w:p>
-      <w:pPr>
-        <w:spacing w:after="0" w:line="240" w:lineRule="auto"/>
-      </w:pPr>
-      <w:r>
-        <w:t xml:space="preserve">The Ellendale campus is a 400 MW greenfield build in Dickey County, and ABB is supplying the power backbone under an </w:t>
-      </w:r>
-      <w:hyperlink w:history="1" r:id="rIdi50l0szy-jjgvc81pwqrr">
+        <w:t xml:space="preserve">, ABB Electrification Business Area President Giampiero Frisio traveled to Ellendale, North Dakota, to walk the Applied Digital campus with Chief Development Officer Todd Gale. Their conversation covers why AI is being called this generation’s space race, what it actually takes to build data centers fast enough to keep up with demand, and how the right partnerships get AI-ready infrastructure delivered faster.</w:t>
+      </w:r>
+    </w:p>
+    <w:p>
+      <w:pPr>
+        <w:spacing w:after="0" w:line="240" w:lineRule="auto"/>
+      </w:pPr>
+    </w:p>
+    <w:p>
+      <w:pPr>
+        <w:spacing w:after="0" w:line="240" w:lineRule="auto"/>
+      </w:pPr>
+      <w:r>
+        <w:t xml:space="preserve">Polaris Forge 1 is a 400 MW AI factory campus in Dickey County, and ABB has supplied the power backbone since the </w:t>
+      </w:r>
+      <w:hyperlink w:history="1" r:id="rIdtyacwl2bhr_flvx3w-ec7">
         <w:r>
           <w:rPr>
             <w:rStyle w:val="Hyperlink"/>
           </w:rPr>
-          <w:t xml:space="preserve">expanded partnership with Applied Digital</w:t>
+          <w:t xml:space="preserve">partnership was announced</w:t>
         </w:r>
       </w:hyperlink>
       <w:r>
-        <w:t xml:space="preserve">, anchored by the HiPerGuard medium-voltage static UPS – the first power system built specifically for AI-scale data centers. Shifting the architecture from low voltage to medium voltage lets the campus scale in 25 MW blocks with fewer conversion points and less cabling, which raises power density and energy efficiency while compressing the electrical plant footprint. Fewer conversion points also means fewer things that can fail.</w:t>
-      </w:r>
-    </w:p>
-    <w:p>
-      <w:pPr>
-        <w:spacing w:after="0" w:line="240" w:lineRule="auto"/>
-      </w:pPr>
-    </w:p>
-    <w:p>
-      <w:pPr>
-        <w:spacing w:after="0" w:line="240" w:lineRule="auto"/>
-      </w:pPr>
-      <w:r>
-        <w:t xml:space="preserve">That efficiency is the whole point in a state where you cannot simply order up new generation. For a rural county of a few thousand people, it also means construction jobs, permanent operations jobs, and a tax base that did not exist five years ago.</w:t>
+        <w:t xml:space="preserve">. At the center of it is ABB’s HiPerGuard medium-voltage static UPS, purpose-built for the power profiles of AI and high-performance computing workloads. Shifting the architecture from low voltage to medium voltage lets the campus scale in 25 MW blocks with less cabling and fewer conversion points, which raises power density and energy efficiency while compressing the electrical plant footprint. Fewer conversion points also means fewer things that can fail. The first of three contracted buildings at the campus is now fully energized at 100 MW.</w:t>
+      </w:r>
+    </w:p>
+    <w:p>
+      <w:pPr>
+        <w:spacing w:after="0" w:line="240" w:lineRule="auto"/>
+      </w:pPr>
+    </w:p>
+    <w:p>
+      <w:pPr>
+        <w:spacing w:after="0" w:line="240" w:lineRule="auto"/>
+      </w:pPr>
+      <w:r>
+        <w:t xml:space="preserve">The two companies have since expanded the partnership to a second North Dakota site – Polaris Forge 2, a 300 MW campus near Harwood phased across two buildings coming online in 2026 and 2027. That efficiency is the whole point in a state where you cannot simply order up new generation. For rural counties of a few thousand people, it also means construction jobs, permanent operations jobs, and a tax base that did not exist five years ago.</w:t>
       </w:r>
     </w:p>
     <w:p>
@@ -289,9 +287,8 @@
         <w:rPr>
           <w:i/>
           <w:iCs/>
-          <w:color w:val="808080"/>
-        </w:rPr>
-        <w:t xml:space="preserve">[IMAGE TK: still from the Watts Brewing episode — Frisio and Gale on the Ellendale campus]</w:t>
+        </w:rPr>
+        <w:t xml:space="preserve">[IMAGE TK]</w:t>
       </w:r>
     </w:p>
     <w:p>
@@ -308,7 +305,7 @@
           <w:sz w:val="20"/>
           <w:szCs w:val="20"/>
         </w:rPr>
-        <w:t xml:space="preserve">ABB Electrification Business Area President Giampiero Frisio and Applied Digital Chief Development Officer Todd Gale at Applied Digital’s AI data center campus in Ellendale, North Dakota</w:t>
+        <w:t xml:space="preserve">ABB Electrification Business Area President Giampiero Frisio and Applied Digital Chief Development Officer Todd Gale at Applied Digital’s Polaris Forge 1 campus in Ellendale, North Dakota</w:t>
       </w:r>
     </w:p>
     <w:p>
@@ -335,7 +332,7 @@
       <w:r>
         <w:t xml:space="preserve">ABB’s </w:t>
       </w:r>
-      <w:hyperlink w:history="1" r:id="rIdr_mrjk7hzia_17zew8_2q">
+      <w:hyperlink w:history="1" r:id="rIdckjouwftgse3dxvasmblu">
         <w:r>
           <w:rPr>
             <w:rStyle w:val="Hyperlink"/>
@@ -357,25 +354,7 @@
         <w:spacing w:after="0" w:line="240" w:lineRule="auto"/>
       </w:pPr>
       <w:r>
-        <w:t xml:space="preserve">Fall stops include Indianapolis (September 25–28), Las Vegas (September 28–30 and October 4–7), Columbus (October 22–24), and Spokane (October 26–29), following an earlier stop in Chicago in May. Roughly 75–80% of what ABB sells in the U.S. is made in the U.S. – the tour is built to make that concrete, one stop at a time.</w:t>
-      </w:r>
-    </w:p>
-    <w:p>
-      <w:pPr>
-        <w:spacing w:after="0" w:line="240" w:lineRule="auto"/>
-      </w:pPr>
-    </w:p>
-    <w:p>
-      <w:pPr>
-        <w:spacing w:after="0" w:line="240" w:lineRule="auto"/>
-      </w:pPr>
-      <w:r>
-        <w:rPr>
-          <w:i/>
-          <w:iCs/>
-          <w:color w:val="808080"/>
-        </w:rPr>
-        <w:t xml:space="preserve">[DRAFTING NOTE: Tour name and coast-to-coast framing are confirmed. The stop list above came from a secondary source and needs a check against the official schedule — please confirm cities, dates, and whether any of these are co-located with trade shows. Also send me the tour landing page URL and I will hyperlink the name, plus any spokespeople, hiring/training announcements, or elected officials attending, and I will work them in.]</w:t>
+        <w:t xml:space="preserve">The tour opened in Chicago in the spring and runs through the fall, with stops in Indianapolis, Las Vegas, Columbus, and Spokane. Roughly 75–80% of what ABB sells in the U.S. is made in the U.S. – the tour is built to make that concrete, one stop at a time.</w:t>
       </w:r>
     </w:p>
     <w:p>
@@ -392,9 +371,8 @@
         <w:rPr>
           <w:i/>
           <w:iCs/>
-          <w:color w:val="808080"/>
-        </w:rPr>
-        <w:t xml:space="preserve">[IMAGE TK: tour vehicle, exhibit floor, or employee photo from a stop]</w:t>
+        </w:rPr>
+        <w:t xml:space="preserve">[IMAGE TK]</w:t>
       </w:r>
     </w:p>
     <w:p>
@@ -445,7 +423,7 @@
       <w:r>
         <w:t xml:space="preserve">June 2026 | CNBC: </w:t>
       </w:r>
-      <w:hyperlink w:history="1" r:id="rIdt4m6jf8dil8ocncmsw5fm">
+      <w:hyperlink w:history="1" r:id="rIdgc91-noj36kuoku3beogs">
         <w:r>
           <w:rPr>
             <w:rStyle w:val="Hyperlink"/>
@@ -471,24 +449,6 @@
       <w:pPr>
         <w:pStyle w:val="ListParagraph"/>
         <w:numPr>
-          <w:ilvl w:val="1"/>
-          <w:numId w:val="2"/>
-        </w:numPr>
-        <w:spacing w:after="0" w:line="240" w:lineRule="auto"/>
-      </w:pPr>
-      <w:r>
-        <w:rPr>
-          <w:i/>
-          <w:iCs/>
-          <w:color w:val="808080"/>
-        </w:rPr>
-        <w:t xml:space="preserve">[CONFIRM: this is the June 4 hit — the last issue already ran the April 22 CNBC interview, so this is the next one up. If you meant a Q2 earnings interview from the week of July 16, I could not find it in search; send the link and I will swap it in. Record $12B orders and the $5.5B Rotork acquisition would give us a stronger investment hook.]</w:t>
-      </w:r>
-    </w:p>
-    <w:p>
-      <w:pPr>
-        <w:pStyle w:val="ListParagraph"/>
-        <w:numPr>
           <w:ilvl w:val="0"/>
           <w:numId w:val="2"/>
         </w:numPr>
@@ -497,7 +457,7 @@
       <w:r>
         <w:t xml:space="preserve">June 2026 | Control Global: </w:t>
       </w:r>
-      <w:hyperlink w:history="1" r:id="rIdznpwlx6bzvfqvc4yojggb">
+      <w:hyperlink w:history="1" r:id="rId7a3hdrooacxanfo9azafq">
         <w:r>
           <w:rPr>
             <w:rStyle w:val="Hyperlink"/>
@@ -531,7 +491,7 @@
       <w:r>
         <w:t xml:space="preserve">June 2026 | Tech Briefs: </w:t>
       </w:r>
-      <w:hyperlink w:history="1" r:id="rIdxceptx2py224dw5wvsgbu">
+      <w:hyperlink w:history="1" r:id="rIddg4fa1j37znkkbrpyuwii">
         <w:r>
           <w:rPr>
             <w:rStyle w:val="Hyperlink"/>
@@ -605,7 +565,7 @@
         </w:numPr>
         <w:spacing w:after="0" w:line="240" w:lineRule="auto"/>
       </w:pPr>
-      <w:hyperlink w:history="1" r:id="rIdo8x20isk7rr_shg31b6sc">
+      <w:hyperlink w:history="1" r:id="rIdt_cncta3n2t2xei9apcoi">
         <w:r>
           <w:rPr>
             <w:rStyle w:val="Hyperlink"/>
@@ -631,124 +591,8 @@
         <w:rPr>
           <w:i/>
           <w:iCs/>
-          <w:color w:val="808080"/>
-        </w:rPr>
-        <w:t xml:space="preserve">[CLOSING GRAPHIC TK: the last issue closed on the NASCAR San Diego promo, which is now stale. Suggest an Accelerate America 250+ Tour banner.]</w:t>
-      </w:r>
-    </w:p>
-    <w:p>
-      <w:pPr>
-        <w:spacing w:after="0" w:line="240" w:lineRule="auto"/>
-      </w:pPr>
-    </w:p>
-    <w:p>
-      <w:pPr>
-        <w:spacing w:after="0" w:line="240" w:lineRule="auto"/>
-      </w:pPr>
-    </w:p>
-    <w:p>
-      <w:pPr>
-        <w:spacing w:after="0" w:line="240" w:lineRule="auto"/>
-      </w:pPr>
-      <w:r>
-        <w:rPr>
-          <w:b/>
-          <w:bCs/>
-          <w:i/>
-          <w:iCs/>
-        </w:rPr>
-        <w:t xml:space="preserve">[Open Items — delete before send]</w:t>
-      </w:r>
-    </w:p>
-    <w:p>
-      <w:pPr>
-        <w:pStyle w:val="ListParagraph"/>
-        <w:numPr>
-          <w:ilvl w:val="0"/>
-          <w:numId w:val="2"/>
-        </w:numPr>
-        <w:spacing w:after="0" w:line="240" w:lineRule="auto"/>
-      </w:pPr>
-      <w:r>
-        <w:t xml:space="preserve">Send date for the masthead.</w:t>
-      </w:r>
-    </w:p>
-    <w:p>
-      <w:pPr>
-        <w:pStyle w:val="ListParagraph"/>
-        <w:numPr>
-          <w:ilvl w:val="0"/>
-          <w:numId w:val="2"/>
-        </w:numPr>
-        <w:spacing w:after="0" w:line="240" w:lineRule="auto"/>
-      </w:pPr>
-      <w:r>
-        <w:t xml:space="preserve">Watts Brewing Ellendale episode link — it is referenced in Giampiero’s LinkedIn post but I could not surface the URL.</w:t>
-      </w:r>
-    </w:p>
-    <w:p>
-      <w:pPr>
-        <w:pStyle w:val="ListParagraph"/>
-        <w:numPr>
-          <w:ilvl w:val="0"/>
-          <w:numId w:val="2"/>
-        </w:numPr>
-        <w:spacing w:after="0" w:line="240" w:lineRule="auto"/>
-      </w:pPr>
-      <w:r>
-        <w:t xml:space="preserve">Accelerate America 250+ Tour: confirm the stop list and dates against the official schedule, and send the tour landing page so I can link it.</w:t>
-      </w:r>
-    </w:p>
-    <w:p>
-      <w:pPr>
-        <w:pStyle w:val="ListParagraph"/>
-        <w:numPr>
-          <w:ilvl w:val="0"/>
-          <w:numId w:val="2"/>
-        </w:numPr>
-        <w:spacing w:after="0" w:line="240" w:lineRule="auto"/>
-      </w:pPr>
-      <w:r>
-        <w:t xml:space="preserve">Confirm the CNBC hit (June 4 vs. a Q2 earnings interview I could not locate).</w:t>
-      </w:r>
-    </w:p>
-    <w:p>
-      <w:pPr>
-        <w:pStyle w:val="ListParagraph"/>
-        <w:numPr>
-          <w:ilvl w:val="0"/>
-          <w:numId w:val="2"/>
-        </w:numPr>
-        <w:spacing w:after="0" w:line="240" w:lineRule="auto"/>
-      </w:pPr>
-      <w:r>
-        <w:t xml:space="preserve">Sourcing flag on the Ellendale feature: HiPerGuard is designed and largely produced in Napier, New Zealand. The efficiency and jobs framing holds, but we should not let it read as an American-manufacturing example the way the Smithsonian and New Berlin items do.</w:t>
-      </w:r>
-    </w:p>
-    <w:p>
-      <w:pPr>
-        <w:pStyle w:val="ListParagraph"/>
-        <w:numPr>
-          <w:ilvl w:val="0"/>
-          <w:numId w:val="2"/>
-        </w:numPr>
-        <w:spacing w:after="0" w:line="240" w:lineRule="auto"/>
-      </w:pPr>
-      <w:r>
-        <w:t xml:space="preserve">Heads-up on the Tech Briefs item: ABB Robotics is being divested to SoftBank, close expected mid-to-late 2026, and the division is already reported as discontinued operations. Worth a check with Comms on whether we want to feature robotics in a U.S. policy newsletter right now.</w:t>
-      </w:r>
-    </w:p>
-    <w:p>
-      <w:pPr>
-        <w:pStyle w:val="ListParagraph"/>
-        <w:numPr>
-          <w:ilvl w:val="0"/>
-          <w:numId w:val="2"/>
-        </w:numPr>
-        <w:spacing w:after="0" w:line="240" w:lineRule="auto"/>
-      </w:pPr>
-      <w:r>
-        <w:t xml:space="preserve">Smithsonian image rights, and confirm the Robredo title as written.</w:t>
+        </w:rPr>
+        <w:t xml:space="preserve">[CLOSING GRAPHIC TK]</w:t>
       </w:r>
     </w:p>
     <w:sectPr>

</xml_diff>

<commit_message>
docs: use TBD instead of TK for newsletter placeholders
Co-Authored-By: Claude Opus 5 <noreply@anthropic.com>
Claude-Session: https://claude.ai/code/session_011q5eW4NuKCCzyAiWXMj3FD
</commit_message>
<xml_diff>
--- a/newsletters/ABB_Newsletter_Draft_Aug2026.docx
+++ b/newsletters/ABB_Newsletter_Draft_Aug2026.docx
@@ -74,7 +74,7 @@
       <w:r>
         <w:t xml:space="preserve">One hundred fifty years ago, America celebrated its 100th birthday with the Centennial Exhibition in Philadelphia – a showcase of what the country could build. The Smithsonian brought those collections home to Washington and put up a building to hold them: the Arts and Industries Building, opened in 1881 and still the second-oldest structure on the Smithsonian campus. As the nation marks 250 years, ABB </w:t>
       </w:r>
-      <w:hyperlink w:history="1" r:id="rIdnz3poezyaaps2apj8k-iv">
+      <w:hyperlink w:history="1" r:id="rIdejp8dht8eva5sq9qy-ouk">
         <w:r>
           <w:rPr>
             <w:rStyle w:val="Hyperlink"/>
@@ -160,7 +160,7 @@
           <w:i/>
           <w:iCs/>
         </w:rPr>
-        <w:t xml:space="preserve">[IMAGE TK]</w:t>
+        <w:t xml:space="preserve">[IMAGE TBD]</w:t>
       </w:r>
     </w:p>
     <w:p>
@@ -177,7 +177,7 @@
           <w:sz w:val="20"/>
           <w:szCs w:val="20"/>
         </w:rPr>
-        <w:t xml:space="preserve">[Caption TK]</w:t>
+        <w:t xml:space="preserve">[Caption TBD]</w:t>
       </w:r>
     </w:p>
     <w:p>
@@ -230,7 +230,7 @@
           <w:i/>
           <w:iCs/>
         </w:rPr>
-        <w:t xml:space="preserve"> [LINK TK]</w:t>
+        <w:t xml:space="preserve"> [LINK TBD]</w:t>
       </w:r>
       <w:r>
         <w:t xml:space="preserve">, ABB Electrification Business Area President Giampiero Frisio traveled to Ellendale, North Dakota, to walk the Applied Digital campus with Chief Development Officer Todd Gale. Their conversation covers why AI is being called this generation’s space race, what it actually takes to build data centers fast enough to keep up with demand, and how the right partnerships get AI-ready infrastructure delivered faster.</w:t>
@@ -248,7 +248,7 @@
       <w:r>
         <w:t xml:space="preserve">Polaris Forge 1 is a 400 MW AI factory campus in Dickey County, and ABB has supplied the power backbone since the </w:t>
       </w:r>
-      <w:hyperlink w:history="1" r:id="rIdtyacwl2bhr_flvx3w-ec7">
+      <w:hyperlink w:history="1" r:id="rIde_zc91paa11ijiuegesz_">
         <w:r>
           <w:rPr>
             <w:rStyle w:val="Hyperlink"/>
@@ -288,7 +288,7 @@
           <w:i/>
           <w:iCs/>
         </w:rPr>
-        <w:t xml:space="preserve">[IMAGE TK]</w:t>
+        <w:t xml:space="preserve">[IMAGE TBD]</w:t>
       </w:r>
     </w:p>
     <w:p>
@@ -332,7 +332,7 @@
       <w:r>
         <w:t xml:space="preserve">ABB’s </w:t>
       </w:r>
-      <w:hyperlink w:history="1" r:id="rIdckjouwftgse3dxvasmblu">
+      <w:hyperlink w:history="1" r:id="rId7-b3n6c38o6zwnqo4of9_">
         <w:r>
           <w:rPr>
             <w:rStyle w:val="Hyperlink"/>
@@ -372,7 +372,7 @@
           <w:i/>
           <w:iCs/>
         </w:rPr>
-        <w:t xml:space="preserve">[IMAGE TK]</w:t>
+        <w:t xml:space="preserve">[IMAGE TBD]</w:t>
       </w:r>
     </w:p>
     <w:p>
@@ -389,7 +389,7 @@
           <w:sz w:val="20"/>
           <w:szCs w:val="20"/>
         </w:rPr>
-        <w:t xml:space="preserve">[Caption TK]</w:t>
+        <w:t xml:space="preserve">[Caption TBD]</w:t>
       </w:r>
     </w:p>
     <w:p>
@@ -423,7 +423,7 @@
       <w:r>
         <w:t xml:space="preserve">June 2026 | CNBC: </w:t>
       </w:r>
-      <w:hyperlink w:history="1" r:id="rIdgc91-noj36kuoku3beogs">
+      <w:hyperlink w:history="1" r:id="rIdiuoh6yxg48w92znhy68jr">
         <w:r>
           <w:rPr>
             <w:rStyle w:val="Hyperlink"/>
@@ -457,7 +457,7 @@
       <w:r>
         <w:t xml:space="preserve">June 2026 | Control Global: </w:t>
       </w:r>
-      <w:hyperlink w:history="1" r:id="rId7a3hdrooacxanfo9azafq">
+      <w:hyperlink w:history="1" r:id="rId0ov_isr9a0gy24gpkcb9d">
         <w:r>
           <w:rPr>
             <w:rStyle w:val="Hyperlink"/>
@@ -491,7 +491,7 @@
       <w:r>
         <w:t xml:space="preserve">June 2026 | Tech Briefs: </w:t>
       </w:r>
-      <w:hyperlink w:history="1" r:id="rIddg4fa1j37znkkbrpyuwii">
+      <w:hyperlink w:history="1" r:id="rId1p-lgrowco59_-t1okqel">
         <w:r>
           <w:rPr>
             <w:rStyle w:val="Hyperlink"/>
@@ -565,7 +565,7 @@
         </w:numPr>
         <w:spacing w:after="0" w:line="240" w:lineRule="auto"/>
       </w:pPr>
-      <w:hyperlink w:history="1" r:id="rIdt_cncta3n2t2xei9apcoi">
+      <w:hyperlink w:history="1" r:id="rIdfpvphf1xv5612vnuwblqb">
         <w:r>
           <w:rPr>
             <w:rStyle w:val="Hyperlink"/>
@@ -592,7 +592,7 @@
           <w:i/>
           <w:iCs/>
         </w:rPr>
-        <w:t xml:space="preserve">[CLOSING GRAPHIC TK]</w:t>
+        <w:t xml:space="preserve">[CLOSING GRAPHIC TBD]</w:t>
       </w:r>
     </w:p>
     <w:sectPr>

</xml_diff>